<commit_message>
study guide addition with mod 2
</commit_message>
<xml_diff>
--- a/Module_02_Linear_Regression/Module_1_2_Study_Guide.docx
+++ b/Module_02_Linear_Regression/Module_1_2_Study_Guide.docx
@@ -9,10 +9,9 @@
       <w:r>
         <w:rPr>
           <w:b/>
-          <w:color w:val="17365D"/>
-          <w:sz w:val="40"/>
+          <w:sz w:val="36"/>
         </w:rPr>
-        <w:t>MSBA 265 — MODULE 1 EXAM STUDY GUIDE</w:t>
+        <w:t>MSBA 265 — MODULE 1 EXPANDED STUDY GUIDE</w:t>
       </w:r>
     </w:p>
     <w:p>
@@ -22,29 +21,21 @@
       <w:r>
         <w:rPr>
           <w:b/>
-          <w:sz w:val="23"/>
         </w:rPr>
-        <w:t>Exploratory Data Analysis • Data Quality • Outliers • Model Choice • Production Pipelines</w:t>
+        <w:t>Study ALL topics below. The exam will sample from this larger pool of concepts.</w:t>
+      </w:r>
+    </w:p>
+    <w:p>
+      <w:r>
+        <w:t>This guide intentionally contains more material than will appear on the exam. Students should be prepared to explain the reasoning behind each concept, not merely memorize an answer choice.</w:t>
       </w:r>
     </w:p>
     <w:p>
       <w:pPr>
-        <w:jc w:val="center"/>
+        <w:pStyle w:val="Heading2"/>
       </w:pPr>
       <w:r>
-        <w:rPr>
-          <w:i/>
-          <w:sz w:val="20"/>
-        </w:rPr>
-        <w:t>Use this guide to know exactly what to review, what to ask yourself, what conclusion to reach, and why.</w:t>
-      </w:r>
-    </w:p>
-    <w:p>
-      <w:pPr>
-        <w:pStyle w:val="Heading1"/>
-      </w:pPr>
-      <w:r>
-        <w:t>How to Study This Module</w:t>
+        <w:t>1. Business Data Dictionary</w:t>
       </w:r>
     </w:p>
     <w:p>
@@ -52,134 +43,32 @@
         <w:rPr>
           <w:b/>
         </w:rPr>
-        <w:t xml:space="preserve">Do not memorize isolated letters or vocabulary. </w:t>
+        <w:t xml:space="preserve">WHERE TO REVIEW: </w:t>
       </w:r>
       <w:r>
-        <w:t xml:space="preserve">For every topic, practice the same four-step thought process: </w:t>
+        <w:t>Workshop / homework: Business Data Dictionary and domain analytics.</w:t>
       </w:r>
+    </w:p>
+    <w:p>
       <w:r>
         <w:rPr>
           <w:b/>
         </w:rPr>
-        <w:t>What is the variable? → What does the EDA show? → What could go wrong? → What action should the analyst take?</w:t>
+        <w:t xml:space="preserve">ASK YOURSELF: </w:t>
+      </w:r>
+      <w:r>
+        <w:t>What does the variable mean in the real business, what unit is it measured in, what values are valid, and how should that meaning affect preprocessing?</w:t>
       </w:r>
     </w:p>
-    <w:tbl>
-      <w:tblPr>
-        <w:tblStyle w:val="TableGrid"/>
-        <w:tblW w:type="auto" w:w="0"/>
-        <w:jc w:val="center"/>
-        <w:tblLook w:firstColumn="1" w:firstRow="1" w:lastColumn="0" w:lastRow="0" w:noHBand="0" w:noVBand="1" w:val="04A0"/>
-      </w:tblPr>
-      <w:tblGrid>
-        <w:gridCol w:w="2592"/>
-        <w:gridCol w:w="2592"/>
-        <w:gridCol w:w="2592"/>
-        <w:gridCol w:w="2592"/>
-      </w:tblGrid>
-      <w:tr>
-        <w:tc>
-          <w:tcPr>
-            <w:tcW w:type="dxa" w:w="2592"/>
-          </w:tcPr>
-          <w:p>
-            <w:r>
-              <w:rPr>
-                <w:b/>
-              </w:rPr>
-              <w:t>1. IDENTIFY</w:t>
-            </w:r>
-          </w:p>
-        </w:tc>
-        <w:tc>
-          <w:tcPr>
-            <w:tcW w:type="dxa" w:w="2592"/>
-          </w:tcPr>
-          <w:p>
-            <w:r>
-              <w:rPr>
-                <w:b/>
-              </w:rPr>
-              <w:t>2. DIAGNOSE</w:t>
-            </w:r>
-          </w:p>
-        </w:tc>
-        <w:tc>
-          <w:tcPr>
-            <w:tcW w:type="dxa" w:w="2592"/>
-          </w:tcPr>
-          <w:p>
-            <w:r>
-              <w:rPr>
-                <w:b/>
-              </w:rPr>
-              <w:t>3. EXPLAIN WHY</w:t>
-            </w:r>
-          </w:p>
-        </w:tc>
-        <w:tc>
-          <w:tcPr>
-            <w:tcW w:type="dxa" w:w="2592"/>
-          </w:tcPr>
-          <w:p>
-            <w:r>
-              <w:rPr>
-                <w:b/>
-              </w:rPr>
-              <w:t>4. CHOOSE ACTION</w:t>
-            </w:r>
-          </w:p>
-        </w:tc>
-      </w:tr>
-      <w:tr>
-        <w:tc>
-          <w:tcPr>
-            <w:tcW w:type="dxa" w:w="2592"/>
-          </w:tcPr>
-          <w:p>
-            <w:r>
-              <w:t>Business meaning / data type</w:t>
-            </w:r>
-          </w:p>
-        </w:tc>
-        <w:tc>
-          <w:tcPr>
-            <w:tcW w:type="dxa" w:w="2592"/>
-          </w:tcPr>
-          <w:p>
-            <w:r>
-              <w:t>Shape, bounds, correlation, outliers</w:t>
-            </w:r>
-          </w:p>
-        </w:tc>
-        <w:tc>
-          <w:tcPr>
-            <w:tcW w:type="dxa" w:w="2592"/>
-          </w:tcPr>
-          <w:p>
-            <w:r>
-              <w:t>Math + domain risk</w:t>
-            </w:r>
-          </w:p>
-        </w:tc>
-        <w:tc>
-          <w:tcPr>
-            <w:tcW w:type="dxa" w:w="2592"/>
-          </w:tcPr>
-          <w:p>
-            <w:r>
-              <w:t>Keep, transform, encode, scale, or change model</w:t>
-            </w:r>
-          </w:p>
-        </w:tc>
-      </w:tr>
-    </w:tbl>
     <w:p>
-      <w:pPr>
-        <w:pStyle w:val="Heading1"/>
-      </w:pPr>
       <w:r>
-        <w:t>The 10 Concepts You Must Be Able to Defend</w:t>
+        <w:rPr>
+          <w:b/>
+        </w:rPr>
+        <w:t xml:space="preserve">ANSWER / WHY: </w:t>
+      </w:r>
+      <w:r>
+        <w:t>A data dictionary connects technical variables to domain definitions, units, valid ranges, and business logic. It prevents technically valid but operationally wrong transformations.</w:t>
       </w:r>
     </w:p>
     <w:p>
@@ -187,63 +76,7 @@
         <w:pStyle w:val="Heading2"/>
       </w:pPr>
       <w:r>
-        <w:t>1. Business Data Dictionary: Why build it before modeling?</w:t>
-      </w:r>
-    </w:p>
-    <w:p>
-      <w:pPr>
-        <w:pStyle w:val="LookHere"/>
-      </w:pPr>
-      <w:r>
-        <w:t xml:space="preserve">WHERE TO LOOK: </w:t>
-      </w:r>
-      <w:r>
-        <w:rPr>
-          <w:b w:val="0"/>
-        </w:rPr>
-        <w:t>Workshop pp. 7–9: Cell 4 and §3.6–3.7, especially the Business Data Dictionary and Four Critical Domain Analytics Insights. Homework Part 2.</w:t>
-      </w:r>
-    </w:p>
-    <w:p>
-      <w:pPr>
-        <w:pStyle w:val="StudyQuestion"/>
-      </w:pPr>
-      <w:r>
-        <w:t xml:space="preserve">ASK YOURSELF: </w:t>
-      </w:r>
-      <w:r>
-        <w:rPr>
-          <w:b w:val="0"/>
-        </w:rPr>
-        <w:t>Before transforming a column, do I know what it actually measures, its unit, data type, valid range, and business meaning?</w:t>
-      </w:r>
-    </w:p>
-    <w:p>
-      <w:pPr>
-        <w:pStyle w:val="Answer"/>
-      </w:pPr>
-      <w:r>
-        <w:t xml:space="preserve">ANSWER YOU SHOULD REACH: </w:t>
-      </w:r>
-      <w:r>
-        <w:rPr>
-          <w:b w:val="0"/>
-        </w:rPr>
-        <w:t>A Business Data Dictionary maps technical variables to domain definitions, operational units, data types, and business logic so those meanings govern downstream feature engineering and preprocessing.</w:t>
-      </w:r>
-    </w:p>
-    <w:p>
-      <w:pPr>
-        <w:pStyle w:val="Why"/>
-      </w:pPr>
-      <w:r>
-        <w:t xml:space="preserve">WHY: </w:t>
-      </w:r>
-      <w:r>
-        <w:rPr>
-          <w:b w:val="0"/>
-        </w:rPr>
-        <w:t>A computer sees values; it does not automatically know that Exposure means time at risk, ClaimNb is a count, or BonusMalus is a regulatory index. The dictionary prevents technically valid but operationally wrong transformations.</w:t>
+        <w:t>2. Density vs. Area / Collinearity</w:t>
       </w:r>
     </w:p>
     <w:p>
@@ -251,10 +84,32 @@
         <w:rPr>
           <w:b/>
         </w:rPr>
-        <w:t xml:space="preserve">EXAM TRIGGER / MEMORY CUE: </w:t>
+        <w:t xml:space="preserve">WHERE TO REVIEW: </w:t>
       </w:r>
       <w:r>
-        <w:t>If an answer says the dictionary exists mainly to delete text columns, compute p-values, or perform train/test splitting, that is not its primary operational purpose.</w:t>
+        <w:t>Workshop: spatial redundancy management.</w:t>
+      </w:r>
+    </w:p>
+    <w:p>
+      <w:r>
+        <w:rPr>
+          <w:b/>
+        </w:rPr>
+        <w:t xml:space="preserve">ASK YOURSELF: </w:t>
+      </w:r>
+      <w:r>
+        <w:t>Are these two predictors providing independent information, or are they two versions of the same underlying concept?</w:t>
+      </w:r>
+    </w:p>
+    <w:p>
+      <w:r>
+        <w:rPr>
+          <w:b/>
+        </w:rPr>
+        <w:t xml:space="preserve">ANSWER / WHY: </w:t>
+      </w:r>
+      <w:r>
+        <w:t>Density is continuous urban density; Area is a binned representation of the same spatial concept. Using both can create redundancy/collinearity and unstable coefficients.</w:t>
       </w:r>
     </w:p>
     <w:p>
@@ -262,63 +117,7 @@
         <w:pStyle w:val="Heading2"/>
       </w:pPr>
       <w:r>
-        <w:t>2. Density vs. Area: Why should both not enter the same linear model?</w:t>
-      </w:r>
-    </w:p>
-    <w:p>
-      <w:pPr>
-        <w:pStyle w:val="LookHere"/>
-      </w:pPr>
-      <w:r>
-        <w:t xml:space="preserve">WHERE TO LOOK: </w:t>
-      </w:r>
-      <w:r>
-        <w:rPr>
-          <w:b w:val="0"/>
-        </w:rPr>
-        <w:t>Workshop p. 8: §3.7, “Density vs. Area — Spatial Redundancy Management.” Homework Part 2.4.</w:t>
-      </w:r>
-    </w:p>
-    <w:p>
-      <w:pPr>
-        <w:pStyle w:val="StudyQuestion"/>
-      </w:pPr>
-      <w:r>
-        <w:t xml:space="preserve">ASK YOURSELF: </w:t>
-      </w:r>
-      <w:r>
-        <w:rPr>
-          <w:b w:val="0"/>
-        </w:rPr>
-        <w:t>Are these two features giving the model genuinely different information, or are they two versions of the same underlying concept?</w:t>
-      </w:r>
-    </w:p>
-    <w:p>
-      <w:pPr>
-        <w:pStyle w:val="Answer"/>
-      </w:pPr>
-      <w:r>
-        <w:t xml:space="preserve">ANSWER YOU SHOULD REACH: </w:t>
-      </w:r>
-      <w:r>
-        <w:rPr>
-          <w:b w:val="0"/>
-        </w:rPr>
-        <w:t>Density is a continuous people/km² measure; Area is a binned ordinal representation of urban density (A = rural through F = urban). Including both creates severe feature redundancy/collinearity and can destabilize coefficient estimates. Select one representation.</w:t>
-      </w:r>
-    </w:p>
-    <w:p>
-      <w:pPr>
-        <w:pStyle w:val="Why"/>
-      </w:pPr>
-      <w:r>
-        <w:t xml:space="preserve">WHY: </w:t>
-      </w:r>
-      <w:r>
-        <w:rPr>
-          <w:b w:val="0"/>
-        </w:rPr>
-        <w:t>When predictors carry overlapping information, the model has difficulty separating their individual effects. The course blueprint keeps continuous log(Density) and excludes Area.</w:t>
+        <w:t>3. KDE and Distribution Shape</w:t>
       </w:r>
     </w:p>
     <w:p>
@@ -326,10 +125,32 @@
         <w:rPr>
           <w:b/>
         </w:rPr>
-        <w:t xml:space="preserve">EXAM TRIGGER / MEMORY CUE: </w:t>
+        <w:t xml:space="preserve">WHERE TO REVIEW: </w:t>
       </w:r>
       <w:r>
-        <w:t>Key phrase to recognize: spatial redundancy / collinearity → unstable or inflated coefficients.</w:t>
+        <w:t>Workshop: KDE visual signals.</w:t>
+      </w:r>
+    </w:p>
+    <w:p>
+      <w:r>
+        <w:rPr>
+          <w:b/>
+        </w:rPr>
+        <w:t xml:space="preserve">ASK YOURSELF: </w:t>
+      </w:r>
+      <w:r>
+        <w:t>Is there one dominant distribution, a long tail, or a separate secondary bump?</w:t>
+      </w:r>
+    </w:p>
+    <w:p>
+      <w:r>
+        <w:rPr>
+          <w:b/>
+        </w:rPr>
+        <w:t xml:space="preserve">ANSWER / WHY: </w:t>
+      </w:r>
+      <w:r>
+        <w:t>An isolated secondary peak can suggest a distinct subgroup or anomalous cluster. Long/asymmetric tails signal skewness and should affect the choice of outlier method/transformation.</w:t>
       </w:r>
     </w:p>
     <w:p>
@@ -337,63 +158,7 @@
         <w:pStyle w:val="Heading2"/>
       </w:pPr>
       <w:r>
-        <w:t>3. KDE Curves: What visual signal suggests a distinct anomalous group?</w:t>
-      </w:r>
-    </w:p>
-    <w:p>
-      <w:pPr>
-        <w:pStyle w:val="LookHere"/>
-      </w:pPr>
-      <w:r>
-        <w:t xml:space="preserve">WHERE TO LOOK: </w:t>
-      </w:r>
-      <w:r>
-        <w:rPr>
-          <w:b w:val="0"/>
-        </w:rPr>
-        <w:t>Workshop p. 14: §4.3.1–4.3.3, especially “Visual Signals for Detecting Outliers on a KDE Curve.”</w:t>
-      </w:r>
-    </w:p>
-    <w:p>
-      <w:pPr>
-        <w:pStyle w:val="StudyQuestion"/>
-      </w:pPr>
-      <w:r>
-        <w:t xml:space="preserve">ASK YOURSELF: </w:t>
-      </w:r>
-      <w:r>
-        <w:rPr>
-          <w:b w:val="0"/>
-        </w:rPr>
-        <w:t>Does the KDE have one smooth dominant peak, or is there a small isolated bump/secondary peak away from the main distribution?</w:t>
-      </w:r>
-    </w:p>
-    <w:p>
-      <w:pPr>
-        <w:pStyle w:val="Answer"/>
-      </w:pPr>
-      <w:r>
-        <w:t xml:space="preserve">ANSWER YOU SHOULD REACH: </w:t>
-      </w:r>
-      <w:r>
-        <w:rPr>
-          <w:b w:val="0"/>
-        </w:rPr>
-        <w:t>An isolated secondary peak (multi-modality) can signal a distinct anomalous group or a cluster of corrupt observations.</w:t>
-      </w:r>
-    </w:p>
-    <w:p>
-      <w:pPr>
-        <w:pStyle w:val="Why"/>
-      </w:pPr>
-      <w:r>
-        <w:t xml:space="preserve">WHY: </w:t>
-      </w:r>
-      <w:r>
-        <w:rPr>
-          <w:b w:val="0"/>
-        </w:rPr>
-        <w:t>The KDE is a smooth estimate of the distribution. A separate “island” means observations are clustering away from the main population rather than merely forming a normal tail.</w:t>
+        <w:t>4. Tukey IQR vs. Z-score</w:t>
       </w:r>
     </w:p>
     <w:p>
@@ -401,10 +166,32 @@
         <w:rPr>
           <w:b/>
         </w:rPr>
-        <w:t xml:space="preserve">EXAM TRIGGER / MEMORY CUE: </w:t>
+        <w:t xml:space="preserve">WHERE TO REVIEW: </w:t>
       </w:r>
       <w:r>
-        <w:t>Also know the other two visual warnings: near-zero long tails and asymmetric long tails/skewness.</w:t>
+        <w:t>Workshop / homework: outlier methods.</w:t>
+      </w:r>
+    </w:p>
+    <w:p>
+      <w:r>
+        <w:rPr>
+          <w:b/>
+        </w:rPr>
+        <w:t xml:space="preserve">ASK YOURSELF: </w:t>
+      </w:r>
+      <w:r>
+        <w:t>Is the distribution symmetric enough for mean/standard-deviation-based cutoffs, or is it heavily skewed?</w:t>
+      </w:r>
+    </w:p>
+    <w:p>
+      <w:r>
+        <w:rPr>
+          <w:b/>
+        </w:rPr>
+        <w:t xml:space="preserve">ANSWER / WHY: </w:t>
+      </w:r>
+      <w:r>
+        <w:t>Tukey uses Q1/Q3/IQR and is more robust to skew. Z-scores depend on μ and σ, which can be distorted by extreme tails.</w:t>
       </w:r>
     </w:p>
     <w:p>
@@ -412,63 +199,7 @@
         <w:pStyle w:val="Heading2"/>
       </w:pPr>
       <w:r>
-        <w:t>4. Tukey IQR vs. Z-score on heavily skewed Density</w:t>
-      </w:r>
-    </w:p>
-    <w:p>
-      <w:pPr>
-        <w:pStyle w:val="LookHere"/>
-      </w:pPr>
-      <w:r>
-        <w:t xml:space="preserve">WHERE TO LOOK: </w:t>
-      </w:r>
-      <w:r>
-        <w:rPr>
-          <w:b w:val="0"/>
-        </w:rPr>
-        <w:t>Workshop pp. 17–19: §4.6 Parametric vs. Non-Parametric Outlier Detection; also p. 15 Density deep-dive. Homework Part 5 uses Tukey 1.5×IQR.</w:t>
-      </w:r>
-    </w:p>
-    <w:p>
-      <w:pPr>
-        <w:pStyle w:val="StudyQuestion"/>
-      </w:pPr>
-      <w:r>
-        <w:t xml:space="preserve">ASK YOURSELF: </w:t>
-      </w:r>
-      <w:r>
-        <w:rPr>
-          <w:b w:val="0"/>
-        </w:rPr>
-        <w:t>Is the distribution roughly symmetric, or is a long tail pulling the mean and standard deviation?</w:t>
-      </w:r>
-    </w:p>
-    <w:p>
-      <w:pPr>
-        <w:pStyle w:val="Answer"/>
-      </w:pPr>
-      <w:r>
-        <w:t xml:space="preserve">ANSWER YOU SHOULD REACH: </w:t>
-      </w:r>
-      <w:r>
-        <w:rPr>
-          <w:b w:val="0"/>
-        </w:rPr>
-        <w:t>For heavily right-skewed Density, Tukey IQR is more robust because it uses Q1 and Q3. Extreme tail values can pull the mean upward and inflate standard deviation, weakening a Z-score cutoff.</w:t>
-      </w:r>
-    </w:p>
-    <w:p>
-      <w:pPr>
-        <w:pStyle w:val="Why"/>
-      </w:pPr>
-      <w:r>
-        <w:t xml:space="preserve">WHY: </w:t>
-      </w:r>
-      <w:r>
-        <w:rPr>
-          <w:b w:val="0"/>
-        </w:rPr>
-        <w:t>Z-scores depend on μ and σ. When the tail inflates those values, an extreme observation may look less extreme than it really is. Quartiles are less sensitive to the long tail.</w:t>
+        <w:t>5. Density Z-score cutoff</w:t>
       </w:r>
     </w:p>
     <w:p>
@@ -476,10 +207,32 @@
         <w:rPr>
           <w:b/>
         </w:rPr>
-        <w:t xml:space="preserve">EXAM TRIGGER / MEMORY CUE: </w:t>
+        <w:t xml:space="preserve">WHERE TO REVIEW: </w:t>
       </w:r>
       <w:r>
-        <w:t>Remember: Tukey fence = Q1 − 1.5×IQR and Q3 + 1.5×IQR.</w:t>
+        <w:t>Workshop Density analysis.</w:t>
+      </w:r>
+    </w:p>
+    <w:p>
+      <w:r>
+        <w:rPr>
+          <w:b/>
+        </w:rPr>
+        <w:t xml:space="preserve">ASK YOURSELF: </w:t>
+      </w:r>
+      <w:r>
+        <w:t>Why might a |Z|&gt;3 boundary become extremely high?</w:t>
+      </w:r>
+    </w:p>
+    <w:p>
+      <w:r>
+        <w:rPr>
+          <w:b/>
+        </w:rPr>
+        <w:t xml:space="preserve">ANSWER / WHY: </w:t>
+      </w:r>
+      <w:r>
+        <w:t>Extreme right-tail values inflate the mean and standard deviation, pushing the Z-score cutoff outward and making it less sensitive to severe skew.</w:t>
       </w:r>
     </w:p>
     <w:p>
@@ -487,63 +240,7 @@
         <w:pStyle w:val="Heading2"/>
       </w:pPr>
       <w:r>
-        <w:t>5. Why the Density Z-score cutoff around 12,970 is misleading</w:t>
-      </w:r>
-    </w:p>
-    <w:p>
-      <w:pPr>
-        <w:pStyle w:val="LookHere"/>
-      </w:pPr>
-      <w:r>
-        <w:t xml:space="preserve">WHERE TO LOOK: </w:t>
-      </w:r>
-      <w:r>
-        <w:rPr>
-          <w:b w:val="0"/>
-        </w:rPr>
-        <w:t>Workshop §4.6 and Density box-plot discussion; Homework solution for Density.</w:t>
-      </w:r>
-    </w:p>
-    <w:p>
-      <w:pPr>
-        <w:pStyle w:val="StudyQuestion"/>
-      </w:pPr>
-      <w:r>
-        <w:t xml:space="preserve">ASK YOURSELF: </w:t>
-      </w:r>
-      <w:r>
-        <w:rPr>
-          <w:b w:val="0"/>
-        </w:rPr>
-        <w:t>If the Z-score boundary is extremely high, what caused it to move that far outward?</w:t>
-      </w:r>
-    </w:p>
-    <w:p>
-      <w:pPr>
-        <w:pStyle w:val="Answer"/>
-      </w:pPr>
-      <w:r>
-        <w:t xml:space="preserve">ANSWER YOU SHOULD REACH: </w:t>
-      </w:r>
-      <w:r>
-        <w:rPr>
-          <w:b w:val="0"/>
-        </w:rPr>
-        <w:t>The right-tail urban Density values inflate μ and σ, pushing the |Z| &gt; 3 cutoff unnaturally high (about 12,970 people/km² in the course example). This can cause Z-scores to miss severe skewness.</w:t>
-      </w:r>
-    </w:p>
-    <w:p>
-      <w:pPr>
-        <w:pStyle w:val="Why"/>
-      </w:pPr>
-      <w:r>
-        <w:t xml:space="preserve">WHY: </w:t>
-      </w:r>
-      <w:r>
-        <w:rPr>
-          <w:b w:val="0"/>
-        </w:rPr>
-        <w:t>The issue is not that Z-scores cannot process large datasets or integers. The issue is the parametric cutoff's sensitivity to a skewed distribution.</w:t>
+        <w:t>6. BonusMalus</w:t>
       </w:r>
     </w:p>
     <w:p>
@@ -551,10 +248,32 @@
         <w:rPr>
           <w:b/>
         </w:rPr>
-        <w:t xml:space="preserve">EXAM TRIGGER / MEMORY CUE: </w:t>
+        <w:t xml:space="preserve">WHERE TO REVIEW: </w:t>
       </w:r>
       <w:r>
-        <w:t>Connect this to the Tukey fence near 3,800 people/km²: the two methods behave very differently because of skew.</w:t>
+        <w:t>Workshop / homework: regulatory metric interpretation.</w:t>
+      </w:r>
+    </w:p>
+    <w:p>
+      <w:r>
+        <w:rPr>
+          <w:b/>
+        </w:rPr>
+        <w:t xml:space="preserve">ASK YOURSELF: </w:t>
+      </w:r>
+      <w:r>
+        <w:t>What does the number mean in the domain rather than mathematically?</w:t>
+      </w:r>
+    </w:p>
+    <w:p>
+      <w:r>
+        <w:rPr>
+          <w:b/>
+        </w:rPr>
+        <w:t xml:space="preserve">ANSWER / WHY: </w:t>
+      </w:r>
+      <w:r>
+        <w:t>In the course materials, 50 represents the maximum 50% discount for a safe driver with 13+ clean years; 100 is neutral; values above 100 indicate surcharge/penalty risk.</w:t>
       </w:r>
     </w:p>
     <w:p>
@@ -562,63 +281,7 @@
         <w:pStyle w:val="Heading2"/>
       </w:pPr>
       <w:r>
-        <w:t>6. BonusMalus: What does a score of 50 mean?</w:t>
-      </w:r>
-    </w:p>
-    <w:p>
-      <w:pPr>
-        <w:pStyle w:val="LookHere"/>
-      </w:pPr>
-      <w:r>
-        <w:t xml:space="preserve">WHERE TO LOOK: </w:t>
-      </w:r>
-      <w:r>
-        <w:rPr>
-          <w:b w:val="0"/>
-        </w:rPr>
-        <w:t>Workshop p. 8: §3.7 “BonusMalus — The Non-Linear Regulatory Benchmark”; Homework boundary audit and distribution statements.</w:t>
-      </w:r>
-    </w:p>
-    <w:p>
-      <w:pPr>
-        <w:pStyle w:val="StudyQuestion"/>
-      </w:pPr>
-      <w:r>
-        <w:t xml:space="preserve">ASK YOURSELF: </w:t>
-      </w:r>
-      <w:r>
-        <w:rPr>
-          <w:b w:val="0"/>
-        </w:rPr>
-        <w:t>Is BonusMalus an ordinary physical measurement, or a regulatory risk index with a meaningful benchmark?</w:t>
-      </w:r>
-    </w:p>
-    <w:p>
-      <w:pPr>
-        <w:pStyle w:val="Answer"/>
-      </w:pPr>
-      <w:r>
-        <w:t xml:space="preserve">ANSWER YOU SHOULD REACH: </w:t>
-      </w:r>
-      <w:r>
-        <w:rPr>
-          <w:b w:val="0"/>
-        </w:rPr>
-        <w:t>In the course materials, BonusMalus = 50 represents a 50% premium discount for a safe driver with 13+ clean years; 100 is neutral; values above 100 indicate surcharge/penalty risk.</w:t>
-      </w:r>
-    </w:p>
-    <w:p>
-      <w:pPr>
-        <w:pStyle w:val="Why"/>
-      </w:pPr>
-      <w:r>
-        <w:t xml:space="preserve">WHY: </w:t>
-      </w:r>
-      <w:r>
-        <w:rPr>
-          <w:b w:val="0"/>
-        </w:rPr>
-        <w:t>You must interpret the number using domain meaning, not treat 50 as “50% risky” or as corrupted data.</w:t>
+        <w:t>7. Raw Boundary Audit</w:t>
       </w:r>
     </w:p>
     <w:p>
@@ -626,10 +289,32 @@
         <w:rPr>
           <w:b/>
         </w:rPr>
-        <w:t xml:space="preserve">EXAM TRIGGER / MEMORY CUE: </w:t>
+        <w:t xml:space="preserve">WHERE TO REVIEW: </w:t>
       </w:r>
       <w:r>
-        <w:t>Useful model action from the workshop: scale the continuous score and consider an Is Surcharge indicator for BonusMalus &gt; 100.</w:t>
+        <w:t>Workshop: df.describe().T / never trust statistics blindly.</w:t>
+      </w:r>
+    </w:p>
+    <w:p>
+      <w:r>
+        <w:rPr>
+          <w:b/>
+        </w:rPr>
+        <w:t xml:space="preserve">ASK YOURSELF: </w:t>
+      </w:r>
+      <w:r>
+        <w:t>Before I trust mean, standard deviation, KDE, or scaling, are the raw minimum and maximum values plausible?</w:t>
+      </w:r>
+    </w:p>
+    <w:p>
+      <w:r>
+        <w:rPr>
+          <w:b/>
+        </w:rPr>
+        <w:t xml:space="preserve">ANSWER / WHY: </w:t>
+      </w:r>
+      <w:r>
+        <w:t>Sentinel values (e.g., −999), negative ages, or negative durations can corrupt statistics, Z-scores, and scaling. Audit and correct true corruption first.</w:t>
       </w:r>
     </w:p>
     <w:p>
@@ -637,63 +322,7 @@
         <w:pStyle w:val="Heading2"/>
       </w:pPr>
       <w:r>
-        <w:t>7. Raw Boundary Audit: Why use df.describe().T before trusting plots/statistics?</w:t>
-      </w:r>
-    </w:p>
-    <w:p>
-      <w:pPr>
-        <w:pStyle w:val="LookHere"/>
-      </w:pPr>
-      <w:r>
-        <w:t xml:space="preserve">WHERE TO LOOK: </w:t>
-      </w:r>
-      <w:r>
-        <w:rPr>
-          <w:b w:val="0"/>
-        </w:rPr>
-        <w:t>Workshop pp. 5–7: §3.4 Structural Audit and §3.4.3 “Never Trust Statistics Blindly!”; Homework Part 2.</w:t>
-      </w:r>
-    </w:p>
-    <w:p>
-      <w:pPr>
-        <w:pStyle w:val="StudyQuestion"/>
-      </w:pPr>
-      <w:r>
-        <w:t xml:space="preserve">ASK YOURSELF: </w:t>
-      </w:r>
-      <w:r>
-        <w:rPr>
-          <w:b w:val="0"/>
-        </w:rPr>
-        <w:t>Before I trust the mean, standard deviation, KDE, or scaler, have I verified that the raw minimum/maximum values are possible?</w:t>
-      </w:r>
-    </w:p>
-    <w:p>
-      <w:pPr>
-        <w:pStyle w:val="Answer"/>
-      </w:pPr>
-      <w:r>
-        <w:t xml:space="preserve">ANSWER YOU SHOULD REACH: </w:t>
-      </w:r>
-      <w:r>
-        <w:rPr>
-          <w:b w:val="0"/>
-        </w:rPr>
-        <w:t>Audit raw bounds first to detect corruptions such as sentinel nulls (e.g., −999), negative driver ages, or negative durations. Such values can drag the mean away from the median and inflate/explode standard deviation, making Z-scores and standard scaling misleading.</w:t>
-      </w:r>
-    </w:p>
-    <w:p>
-      <w:pPr>
-        <w:pStyle w:val="Why"/>
-      </w:pPr>
-      <w:r>
-        <w:t xml:space="preserve">WHY: </w:t>
-      </w:r>
-      <w:r>
-        <w:rPr>
-          <w:b w:val="0"/>
-        </w:rPr>
-        <w:t>A beautiful chart can still be built from bad data. Data quality verification must happen before interpreting downstream statistics.</w:t>
+        <w:t>8. Statistical Outlier ≠ Bad Record</w:t>
       </w:r>
     </w:p>
     <w:p>
@@ -701,10 +330,32 @@
         <w:rPr>
           <w:b/>
         </w:rPr>
-        <w:t xml:space="preserve">EXAM TRIGGER / MEMORY CUE: </w:t>
+        <w:t xml:space="preserve">WHERE TO REVIEW: </w:t>
       </w:r>
       <w:r>
-        <w:t>Course audit examples: DrivAge 18–100; Exposure has no negative duration; BonusMalus 50–350.</w:t>
+        <w:t>Workshop / homework: Density box plot.</w:t>
+      </w:r>
+    </w:p>
+    <w:p>
+      <w:r>
+        <w:rPr>
+          <w:b/>
+        </w:rPr>
+        <w:t xml:space="preserve">ASK YOURSELF: </w:t>
+      </w:r>
+      <w:r>
+        <w:t>Is this observation impossible, or simply rare but valid?</w:t>
+      </w:r>
+    </w:p>
+    <w:p>
+      <w:r>
+        <w:rPr>
+          <w:b/>
+        </w:rPr>
+        <w:t xml:space="preserve">ANSWER / WHY: </w:t>
+      </w:r>
+      <w:r>
+        <w:t>Valid high-density metropolitan records should not automatically be deleted. Removing them can create selection bias. The course approach retains valid values and uses log(1 + Density).</w:t>
       </w:r>
     </w:p>
     <w:p>
@@ -712,63 +363,7 @@
         <w:pStyle w:val="Heading2"/>
       </w:pPr>
       <w:r>
-        <w:t>8. Statistical outlier ≠ bad record: what to do with valid urban Density values</w:t>
-      </w:r>
-    </w:p>
-    <w:p>
-      <w:pPr>
-        <w:pStyle w:val="LookHere"/>
-      </w:pPr>
-      <w:r>
-        <w:t xml:space="preserve">WHERE TO LOOK: </w:t>
-      </w:r>
-      <w:r>
-        <w:rPr>
-          <w:b w:val="0"/>
-        </w:rPr>
-        <w:t>Workshop p. 15: Density Box Plot deep-dive; Homework Part 4 solution.</w:t>
-      </w:r>
-    </w:p>
-    <w:p>
-      <w:pPr>
-        <w:pStyle w:val="StudyQuestion"/>
-      </w:pPr>
-      <w:r>
-        <w:t xml:space="preserve">ASK YOURSELF: </w:t>
-      </w:r>
-      <w:r>
-        <w:rPr>
-          <w:b w:val="0"/>
-        </w:rPr>
-        <w:t>Is this point impossible/corrupt, or merely rare but valid in the real business population?</w:t>
-      </w:r>
-    </w:p>
-    <w:p>
-      <w:pPr>
-        <w:pStyle w:val="Answer"/>
-      </w:pPr>
-      <w:r>
-        <w:t xml:space="preserve">ANSWER YOU SHOULD REACH: </w:t>
-      </w:r>
-      <w:r>
-        <w:rPr>
-          <w:b w:val="0"/>
-        </w:rPr>
-        <w:t>Density values around 5,000–25,000 people/km² can sit beyond the Tukey fence (~3,800) yet represent valid metropolitan policyholders. Do not automatically delete them. For statewide risk pricing, dropping them removes urban risk and creates selection bias. Retain valid records and apply log(1 + Density) to compress the long right tail.</w:t>
-      </w:r>
-    </w:p>
-    <w:p>
-      <w:pPr>
-        <w:pStyle w:val="Why"/>
-      </w:pPr>
-      <w:r>
-        <w:t xml:space="preserve">WHY: </w:t>
-      </w:r>
-      <w:r>
-        <w:rPr>
-          <w:b w:val="0"/>
-        </w:rPr>
-        <w:t>Outlier detection is a flag for investigation, not an automatic deletion command. Domain context decides whether a rare value is corruption or a legitimate customer.</w:t>
+        <w:t>9. OLS vs. Claim Counts</w:t>
       </w:r>
     </w:p>
     <w:p>
@@ -776,10 +371,32 @@
         <w:rPr>
           <w:b/>
         </w:rPr>
-        <w:t xml:space="preserve">EXAM TRIGGER / MEMORY CUE: </w:t>
+        <w:t xml:space="preserve">WHERE TO REVIEW: </w:t>
       </w:r>
       <w:r>
-        <w:t>Use the phrase: statistically unusual, but operationally valid.</w:t>
+        <w:t>Workshop: EDA → model architecture.</w:t>
+      </w:r>
+    </w:p>
+    <w:p>
+      <w:r>
+        <w:rPr>
+          <w:b/>
+        </w:rPr>
+        <w:t xml:space="preserve">ASK YOURSELF: </w:t>
+      </w:r>
+      <w:r>
+        <w:t>Does the target behave like a continuous response, or is it a discrete non-negative count?</w:t>
+      </w:r>
+    </w:p>
+    <w:p>
+      <w:r>
+        <w:rPr>
+          <w:b/>
+        </w:rPr>
+        <w:t xml:space="preserve">ANSWER / WHY: </w:t>
+      </w:r>
+      <w:r>
+        <w:t>ClaimNb is count data with many zeros in the course materials. The course directs students to a Poisson GLM with log(Exposure) as an offset rather than raw OLS.</w:t>
       </w:r>
     </w:p>
     <w:p>
@@ -787,63 +404,7 @@
         <w:pStyle w:val="Heading2"/>
       </w:pPr>
       <w:r>
-        <w:t>9. OLS vs. ClaimNb: let EDA choose the model architecture</w:t>
-      </w:r>
-    </w:p>
-    <w:p>
-      <w:pPr>
-        <w:pStyle w:val="LookHere"/>
-      </w:pPr>
-      <w:r>
-        <w:t xml:space="preserve">WHERE TO LOOK: </w:t>
-      </w:r>
-      <w:r>
-        <w:rPr>
-          <w:b w:val="0"/>
-        </w:rPr>
-        <w:t>Workshop pp. 21–22: §4.8.2–4.8.3 “How Module 1 Dictates Our Downstream Model Choice.” Homework ClaimNb defense.</w:t>
-      </w:r>
-    </w:p>
-    <w:p>
-      <w:pPr>
-        <w:pStyle w:val="StudyQuestion"/>
-      </w:pPr>
-      <w:r>
-        <w:t xml:space="preserve">ASK YOURSELF: </w:t>
-      </w:r>
-      <w:r>
-        <w:rPr>
-          <w:b w:val="0"/>
-        </w:rPr>
-        <w:t>What type of target is this: continuous and approximately symmetric, or a discrete non-negative count with many zeros?</w:t>
-      </w:r>
-    </w:p>
-    <w:p>
-      <w:pPr>
-        <w:pStyle w:val="Answer"/>
-      </w:pPr>
-      <w:r>
-        <w:t xml:space="preserve">ANSWER YOU SHOULD REACH: </w:t>
-      </w:r>
-      <w:r>
-        <w:rPr>
-          <w:b w:val="0"/>
-        </w:rPr>
-        <w:t>OLS is a candidate for continuous, symmetric/unskewed targets. ClaimNb is a discrete integer count (0,1,2,...) with &gt;95% zeros in the course materials. Raw OLS can predict impossible negative claim counts and violates the constant-variance framing used in the lesson. The course-directed architecture is a Poisson GLM with log(Exposure) as an offset.</w:t>
-      </w:r>
-    </w:p>
-    <w:p>
-      <w:pPr>
-        <w:pStyle w:val="Why"/>
-      </w:pPr>
-      <w:r>
-        <w:t xml:space="preserve">WHY: </w:t>
-      </w:r>
-      <w:r>
-        <w:rPr>
-          <w:b w:val="0"/>
-        </w:rPr>
-        <w:t>Model choice should follow the target's mathematical and business structure. Exposure matters because claim opportunity depends on how long the policy was active.</w:t>
+        <w:t>10. Training vs. Production Inference</w:t>
       </w:r>
     </w:p>
     <w:p>
@@ -851,10 +412,32 @@
         <w:rPr>
           <w:b/>
         </w:rPr>
-        <w:t xml:space="preserve">EXAM TRIGGER / MEMORY CUE: </w:t>
+        <w:t xml:space="preserve">WHERE TO REVIEW: </w:t>
       </w:r>
       <w:r>
-        <w:t>Also remember the transformation lesson: ClaimNb is a count and zero is meaningful; do not blindly log-transform it. The materials emphasize log(0) = −∞ for the ordinary log.</w:t>
+        <w:t>Workshop: Golden Rule.</w:t>
+      </w:r>
+    </w:p>
+    <w:p>
+      <w:r>
+        <w:rPr>
+          <w:b/>
+        </w:rPr>
+        <w:t xml:space="preserve">ASK YOURSELF: </w:t>
+      </w:r>
+      <w:r>
+        <w:t>Will a new live record receive exactly the same cleaning, transformation, and encoding used during training?</w:t>
+      </w:r>
+    </w:p>
+    <w:p>
+      <w:r>
+        <w:rPr>
+          <w:b/>
+        </w:rPr>
+        <w:t xml:space="preserve">ANSWER / WHY: </w:t>
+      </w:r>
+      <w:r>
+        <w:t>Training preprocessing must be identically reproduced during inference. Otherwise pipeline skew can cause runtime failures or inaccurate scoring.</w:t>
       </w:r>
     </w:p>
     <w:p>
@@ -862,63 +445,7 @@
         <w:pStyle w:val="Heading2"/>
       </w:pPr>
       <w:r>
-        <w:t>10. Training vs. Production Inference: the Golden Rule</w:t>
-      </w:r>
-    </w:p>
-    <w:p>
-      <w:pPr>
-        <w:pStyle w:val="LookHere"/>
-      </w:pPr>
-      <w:r>
-        <w:t xml:space="preserve">WHERE TO LOOK: </w:t>
-      </w:r>
-      <w:r>
-        <w:rPr>
-          <w:b w:val="0"/>
-        </w:rPr>
-        <w:t>Workshop p. 7 “Crucial Engineering Lesson: Training vs. Production Inference Alignment,” p. 20 workflow summary, and p. 23 production script.</w:t>
-      </w:r>
-    </w:p>
-    <w:p>
-      <w:pPr>
-        <w:pStyle w:val="StudyQuestion"/>
-      </w:pPr>
-      <w:r>
-        <w:t xml:space="preserve">ASK YOURSELF: </w:t>
-      </w:r>
-      <w:r>
-        <w:rPr>
-          <w:b w:val="0"/>
-        </w:rPr>
-        <w:t>Will a brand-new customer be cleaned, transformed, and encoded in exactly the same way as the data used to train the model?</w:t>
-      </w:r>
-    </w:p>
-    <w:p>
-      <w:pPr>
-        <w:pStyle w:val="Answer"/>
-      </w:pPr>
-      <w:r>
-        <w:t xml:space="preserve">ANSWER YOU SHOULD REACH: </w:t>
-      </w:r>
-      <w:r>
-        <w:rPr>
-          <w:b w:val="0"/>
-        </w:rPr>
-        <w:t>Any cleaning or transformation applied during training must be identically applied during production inference.</w:t>
-      </w:r>
-    </w:p>
-    <w:p>
-      <w:pPr>
-        <w:pStyle w:val="Why"/>
-      </w:pPr>
-      <w:r>
-        <w:t xml:space="preserve">WHY: </w:t>
-      </w:r>
-      <w:r>
-        <w:rPr>
-          <w:b w:val="0"/>
-        </w:rPr>
-        <w:t>If an outlier rule, encoding step, imputation rule, or transformation is omitted at inference, the model receives data in a different representation than it learned from. The course materials identify pipeline skew, runtime failures, and inaccurate risk scores as consequences.</w:t>
+        <w:t>11. Correlation Before Modeling</w:t>
       </w:r>
     </w:p>
     <w:p>
@@ -926,10 +453,401 @@
         <w:rPr>
           <w:b/>
         </w:rPr>
-        <w:t xml:space="preserve">EXAM TRIGGER / MEMORY CUE: </w:t>
+        <w:t xml:space="preserve">WHERE TO REVIEW: </w:t>
       </w:r>
       <w:r>
-        <w:t>Think: same pipeline in training + live scoring. Reusable production code is how you enforce that alignment.</w:t>
+        <w:t>01_simple_linear.py.</w:t>
+      </w:r>
+    </w:p>
+    <w:p>
+      <w:r>
+        <w:rPr>
+          <w:b/>
+        </w:rPr>
+        <w:t xml:space="preserve">ASK YOURSELF: </w:t>
+      </w:r>
+      <w:r>
+        <w:t>Before fitting a line, do X and Y show a linear relationship, and in what direction/strength?</w:t>
+      </w:r>
+    </w:p>
+    <w:p>
+      <w:r>
+        <w:rPr>
+          <w:b/>
+        </w:rPr>
+        <w:t xml:space="preserve">ANSWER / WHY: </w:t>
+      </w:r>
+      <w:r>
+        <w:t>Pearson correlation summarizes direction and strength of linear association. Script 1 uses it as EDA; it does not train a model yet. Correlation does not prove causation.</w:t>
+      </w:r>
+    </w:p>
+    <w:p>
+      <w:pPr>
+        <w:pStyle w:val="Heading2"/>
+      </w:pPr>
+      <w:r>
+        <w:t>12. Feature vs. Target</w:t>
+      </w:r>
+    </w:p>
+    <w:p>
+      <w:r>
+        <w:rPr>
+          <w:b/>
+        </w:rPr>
+        <w:t xml:space="preserve">WHERE TO REVIEW: </w:t>
+      </w:r>
+      <w:r>
+        <w:t>01_simple_linear.py and 02_ols_normal_equation.py.</w:t>
+      </w:r>
+    </w:p>
+    <w:p>
+      <w:r>
+        <w:rPr>
+          <w:b/>
+        </w:rPr>
+        <w:t xml:space="preserve">ASK YOURSELF: </w:t>
+      </w:r>
+      <w:r>
+        <w:t>What information is the model using, and what is it trying to predict?</w:t>
+      </w:r>
+    </w:p>
+    <w:p>
+      <w:r>
+        <w:rPr>
+          <w:b/>
+        </w:rPr>
+        <w:t xml:space="preserve">ANSWER / WHY: </w:t>
+      </w:r>
+      <w:r>
+        <w:t>In the course scripts, BMI is the feature X and expenses is the target Y. Separating predictors from the target is a basic supervised-learning step.</w:t>
+      </w:r>
+    </w:p>
+    <w:p>
+      <w:pPr>
+        <w:pStyle w:val="Heading2"/>
+      </w:pPr>
+      <w:r>
+        <w:t>13. Simple Linear Regression Equation</w:t>
+      </w:r>
+    </w:p>
+    <w:p>
+      <w:r>
+        <w:rPr>
+          <w:b/>
+        </w:rPr>
+        <w:t xml:space="preserve">WHERE TO REVIEW: </w:t>
+      </w:r>
+      <w:r>
+        <w:t>02_ols_normal_equation.py.</w:t>
+      </w:r>
+    </w:p>
+    <w:p>
+      <w:r>
+        <w:rPr>
+          <w:b/>
+        </w:rPr>
+        <w:t xml:space="preserve">ASK YOURSELF: </w:t>
+      </w:r>
+      <w:r>
+        <w:t>What do w0 and w1 mean in ŷ = w0 + w1x?</w:t>
+      </w:r>
+    </w:p>
+    <w:p>
+      <w:r>
+        <w:rPr>
+          <w:b/>
+        </w:rPr>
+        <w:t xml:space="preserve">ANSWER / WHY: </w:t>
+      </w:r>
+      <w:r>
+        <w:t>w0 is the intercept/baseline prediction at x=0. w1 is the slope: the expected change in predicted Y for a +1 change in X.</w:t>
+      </w:r>
+    </w:p>
+    <w:p>
+      <w:pPr>
+        <w:pStyle w:val="Heading2"/>
+      </w:pPr>
+      <w:r>
+        <w:t>14. Residuals</w:t>
+      </w:r>
+    </w:p>
+    <w:p>
+      <w:r>
+        <w:rPr>
+          <w:b/>
+        </w:rPr>
+        <w:t xml:space="preserve">WHERE TO REVIEW: </w:t>
+      </w:r>
+      <w:r>
+        <w:t>02_ols_normal_equation.py.</w:t>
+      </w:r>
+    </w:p>
+    <w:p>
+      <w:r>
+        <w:rPr>
+          <w:b/>
+        </w:rPr>
+        <w:t xml:space="preserve">ASK YOURSELF: </w:t>
+      </w:r>
+      <w:r>
+        <w:t>How far was the prediction from the observed value?</w:t>
+      </w:r>
+    </w:p>
+    <w:p>
+      <w:r>
+        <w:rPr>
+          <w:b/>
+        </w:rPr>
+        <w:t xml:space="preserve">ANSWER / WHY: </w:t>
+      </w:r>
+      <w:r>
+        <w:t>Residual = actual − predicted. Positive means the actual value was above the prediction; negative means the prediction was above the actual value.</w:t>
+      </w:r>
+    </w:p>
+    <w:p>
+      <w:pPr>
+        <w:pStyle w:val="Heading2"/>
+      </w:pPr>
+      <w:r>
+        <w:t>15. MSE and R²</w:t>
+      </w:r>
+    </w:p>
+    <w:p>
+      <w:r>
+        <w:rPr>
+          <w:b/>
+        </w:rPr>
+        <w:t xml:space="preserve">WHERE TO REVIEW: </w:t>
+      </w:r>
+      <w:r>
+        <w:t>02_ols_normal_equation.py and 03_gradient_descent.py.</w:t>
+      </w:r>
+    </w:p>
+    <w:p>
+      <w:r>
+        <w:rPr>
+          <w:b/>
+        </w:rPr>
+        <w:t xml:space="preserve">ASK YOURSELF: </w:t>
+      </w:r>
+      <w:r>
+        <w:t>How much prediction error is there, and how much variation does the model explain?</w:t>
+      </w:r>
+    </w:p>
+    <w:p>
+      <w:r>
+        <w:rPr>
+          <w:b/>
+        </w:rPr>
+        <w:t xml:space="preserve">ANSWER / WHY: </w:t>
+      </w:r>
+      <w:r>
+        <w:t>MSE is average squared prediction error (lower is better when comparing like models/data). R² is the fraction of outcome variation explained by the fitted model; closer to 1 indicates more explained variation.</w:t>
+      </w:r>
+    </w:p>
+    <w:p>
+      <w:pPr>
+        <w:pStyle w:val="Heading2"/>
+      </w:pPr>
+      <w:r>
+        <w:t>16. Normal Equation</w:t>
+      </w:r>
+    </w:p>
+    <w:p>
+      <w:r>
+        <w:rPr>
+          <w:b/>
+        </w:rPr>
+        <w:t xml:space="preserve">WHERE TO REVIEW: </w:t>
+      </w:r>
+      <w:r>
+        <w:t>02_ols_normal_equation.py.</w:t>
+      </w:r>
+    </w:p>
+    <w:p>
+      <w:r>
+        <w:rPr>
+          <w:b/>
+        </w:rPr>
+        <w:t xml:space="preserve">ASK YOURSELF: </w:t>
+      </w:r>
+      <w:r>
+        <w:t>How does this script find the OLS coefficients?</w:t>
+      </w:r>
+    </w:p>
+    <w:p>
+      <w:r>
+        <w:rPr>
+          <w:b/>
+        </w:rPr>
+        <w:t xml:space="preserve">ANSWER / WHY: </w:t>
+      </w:r>
+      <w:r>
+        <w:t>It uses the closed-form Normal Equation θ=(XᵀX)⁻¹Xᵀy to solve directly for w0 and w1 rather than updating them iteratively.</w:t>
+      </w:r>
+    </w:p>
+    <w:p>
+      <w:pPr>
+        <w:pStyle w:val="Heading2"/>
+      </w:pPr>
+      <w:r>
+        <w:t>17. Normal Equation vs. Gradient Descent</w:t>
+      </w:r>
+    </w:p>
+    <w:p>
+      <w:r>
+        <w:rPr>
+          <w:b/>
+        </w:rPr>
+        <w:t xml:space="preserve">WHERE TO REVIEW: </w:t>
+      </w:r>
+      <w:r>
+        <w:t>02_ols_normal_equation.py + 03_gradient_descent.py.</w:t>
+      </w:r>
+    </w:p>
+    <w:p>
+      <w:r>
+        <w:rPr>
+          <w:b/>
+        </w:rPr>
+        <w:t xml:space="preserve">ASK YOURSELF: </w:t>
+      </w:r>
+      <w:r>
+        <w:t>Does the method solve directly, or repeatedly move toward lower error?</w:t>
+      </w:r>
+    </w:p>
+    <w:p>
+      <w:r>
+        <w:rPr>
+          <w:b/>
+        </w:rPr>
+        <w:t xml:space="preserve">ANSWER / WHY: </w:t>
+      </w:r>
+      <w:r>
+        <w:t>Normal Equation = closed-form/direct solution. Gradient Descent = iterative optimization that repeatedly updates weights in the direction that reduces loss.</w:t>
+      </w:r>
+    </w:p>
+    <w:p>
+      <w:pPr>
+        <w:pStyle w:val="Heading2"/>
+      </w:pPr>
+      <w:r>
+        <w:t>18. Standardization for Gradient Descent</w:t>
+      </w:r>
+    </w:p>
+    <w:p>
+      <w:r>
+        <w:rPr>
+          <w:b/>
+        </w:rPr>
+        <w:t xml:space="preserve">WHERE TO REVIEW: </w:t>
+      </w:r>
+      <w:r>
+        <w:t>03_gradient_descent.py.</w:t>
+      </w:r>
+    </w:p>
+    <w:p>
+      <w:r>
+        <w:rPr>
+          <w:b/>
+        </w:rPr>
+        <w:t xml:space="preserve">ASK YOURSELF: </w:t>
+      </w:r>
+      <w:r>
+        <w:t>Why center/scale a feature before iterative optimization?</w:t>
+      </w:r>
+    </w:p>
+    <w:p>
+      <w:r>
+        <w:rPr>
+          <w:b/>
+        </w:rPr>
+        <w:t xml:space="preserve">ANSWER / WHY: </w:t>
+      </w:r>
+      <w:r>
+        <w:t>The script standardizes BMI so Gradient Descent is more stable and faster. It later converts the learned coefficients back to the original BMI units.</w:t>
+      </w:r>
+    </w:p>
+    <w:p>
+      <w:pPr>
+        <w:pStyle w:val="Heading2"/>
+      </w:pPr>
+      <w:r>
+        <w:t>19. Learning Rate</w:t>
+      </w:r>
+    </w:p>
+    <w:p>
+      <w:r>
+        <w:rPr>
+          <w:b/>
+        </w:rPr>
+        <w:t xml:space="preserve">WHERE TO REVIEW: </w:t>
+      </w:r>
+      <w:r>
+        <w:t>03_gradient_descent.py.</w:t>
+      </w:r>
+    </w:p>
+    <w:p>
+      <w:r>
+        <w:rPr>
+          <w:b/>
+        </w:rPr>
+        <w:t xml:space="preserve">ASK YOURSELF: </w:t>
+      </w:r>
+      <w:r>
+        <w:t>How large is each Gradient Descent update step?</w:t>
+      </w:r>
+    </w:p>
+    <w:p>
+      <w:r>
+        <w:rPr>
+          <w:b/>
+        </w:rPr>
+        <w:t xml:space="preserve">ANSWER / WHY: </w:t>
+      </w:r>
+      <w:r>
+        <w:t>The learning rate controls step size. Too small can be stable but slow; too large can overshoot, oscillate, or diverge.</w:t>
+      </w:r>
+    </w:p>
+    <w:p>
+      <w:pPr>
+        <w:pStyle w:val="Heading2"/>
+      </w:pPr>
+      <w:r>
+        <w:t>20. Epochs and Convergence</w:t>
+      </w:r>
+    </w:p>
+    <w:p>
+      <w:r>
+        <w:rPr>
+          <w:b/>
+        </w:rPr>
+        <w:t xml:space="preserve">WHERE TO REVIEW: </w:t>
+      </w:r>
+      <w:r>
+        <w:t>03_gradient_descent.py.</w:t>
+      </w:r>
+    </w:p>
+    <w:p>
+      <w:r>
+        <w:rPr>
+          <w:b/>
+        </w:rPr>
+        <w:t xml:space="preserve">ASK YOURSELF: </w:t>
+      </w:r>
+      <w:r>
+        <w:t>How often has the algorithm passed through the training data, and has loss stopped improving?</w:t>
+      </w:r>
+    </w:p>
+    <w:p>
+      <w:r>
+        <w:rPr>
+          <w:b/>
+        </w:rPr>
+        <w:t xml:space="preserve">ANSWER / WHY: </w:t>
+      </w:r>
+      <w:r>
+        <w:t>An epoch is one full pass through the training rows in this full-batch script. More epochs give more update opportunities; if MSE stops changing much, the model has likely converged.</w:t>
       </w:r>
     </w:p>
     <w:p>
@@ -942,84 +860,7 @@
         <w:pStyle w:val="Heading1"/>
       </w:pPr>
       <w:r>
-        <w:t>Short-Answer Defense Templates</w:t>
-      </w:r>
-    </w:p>
-    <w:p>
-      <w:r>
-        <w:t>For written responses, do not stop at naming a technique. Use this structure: FINDING → WHY IT MATTERS → BUSINESS/MATH RISK → CORRECT ACTION.</w:t>
-      </w:r>
-    </w:p>
-    <w:p>
-      <w:pPr>
-        <w:pStyle w:val="Heading2"/>
-      </w:pPr>
-      <w:r>
-        <w:t>Data Quality / Raw Bounds</w:t>
-      </w:r>
-    </w:p>
-    <w:p>
-      <w:pPr>
-        <w:ind w:left="259"/>
-      </w:pPr>
-      <w:r>
-        <w:t>First audit raw boundaries with df.describe().T before trusting summary statistics or KDE curves. Impossible values such as sentinel −999 codes, negative driver ages, or negative exposure durations can distort the mean and inflate standard deviation. That distortion makes Z-scores and standard scaling unreliable. Therefore, verify valid ranges and correct true corruptions before downstream EDA or preprocessing.</w:t>
-      </w:r>
-    </w:p>
-    <w:p>
-      <w:pPr>
-        <w:pStyle w:val="Heading2"/>
-      </w:pPr>
-      <w:r>
-        <w:t>Valid Density “Outliers”</w:t>
-      </w:r>
-    </w:p>
-    <w:p>
-      <w:pPr>
-        <w:ind w:left="259"/>
-      </w:pPr>
-      <w:r>
-        <w:t>The observations are statistical outliers because they exceed the Tukey upper fence, but they may still be valid metropolitan policyholders. Deleting them would remove urban risk from the modeled population and create selection bias. Retain valid records and use log(1 + Density) to compress the long right tail before modeling.</w:t>
-      </w:r>
-    </w:p>
-    <w:p>
-      <w:pPr>
-        <w:pStyle w:val="Heading2"/>
-      </w:pPr>
-      <w:r>
-        <w:t>ClaimNb Model Choice</w:t>
-      </w:r>
-    </w:p>
-    <w:p>
-      <w:pPr>
-        <w:ind w:left="259"/>
-      </w:pPr>
-      <w:r>
-        <w:t>ClaimNb is a discrete, non-negative claim count and is heavily zero-inflated in our Module 1 data. OLS is designed in this lesson for continuous targets and can produce impossible negative claim predictions while failing the constant-variance assumption. Therefore, the course-directed model is a Poisson GLM with log(Exposure) as an offset so claim counts are modeled relative to time at risk.</w:t>
-      </w:r>
-    </w:p>
-    <w:p>
-      <w:pPr>
-        <w:pStyle w:val="Heading2"/>
-      </w:pPr>
-      <w:r>
-        <w:t>Pipeline Alignment</w:t>
-      </w:r>
-    </w:p>
-    <w:p>
-      <w:pPr>
-        <w:ind w:left="259"/>
-      </w:pPr>
-      <w:r>
-        <w:t>Every cleaning, transformation, and encoding step used during model training must also be applied identically during live inference. If production omits a step, the incoming data no longer matches the representation learned during training, causing pipeline skew, possible runtime failures, and inaccurate risk scores.</w:t>
-      </w:r>
-    </w:p>
-    <w:p>
-      <w:pPr>
-        <w:pStyle w:val="Heading1"/>
-      </w:pPr>
-      <w:r>
-        <w:t>Fast Recall Sheet</w:t>
+        <w:t>Fast Recall: Linear Regression Files</w:t>
       </w:r>
     </w:p>
     <w:tbl>
@@ -1030,33 +871,27 @@
         <w:tblLook w:firstColumn="1" w:firstRow="1" w:lastColumn="0" w:lastRow="0" w:noHBand="0" w:noVBand="1" w:val="04A0"/>
       </w:tblPr>
       <w:tblGrid>
-        <w:gridCol w:w="5184"/>
-        <w:gridCol w:w="5184"/>
+        <w:gridCol w:w="5040"/>
+        <w:gridCol w:w="5040"/>
       </w:tblGrid>
       <w:tr>
         <w:tc>
           <w:tcPr>
-            <w:tcW w:type="dxa" w:w="5184"/>
+            <w:tcW w:type="dxa" w:w="5040"/>
           </w:tcPr>
           <w:p>
             <w:r>
-              <w:rPr>
-                <w:b/>
-              </w:rPr>
-              <w:t>SEE THIS</w:t>
+              <w:t>CONCEPT</w:t>
             </w:r>
           </w:p>
         </w:tc>
         <w:tc>
           <w:tcPr>
-            <w:tcW w:type="dxa" w:w="5184"/>
+            <w:tcW w:type="dxa" w:w="5040"/>
           </w:tcPr>
           <w:p>
             <w:r>
-              <w:rPr>
-                <w:b/>
-              </w:rPr>
-              <w:t>THINK THIS</w:t>
+              <w:t>FAST RECALL</w:t>
             </w:r>
           </w:p>
         </w:tc>
@@ -1064,21 +899,21 @@
       <w:tr>
         <w:tc>
           <w:tcPr>
-            <w:tcW w:type="dxa" w:w="5184"/>
+            <w:tcW w:type="dxa" w:w="5040"/>
           </w:tcPr>
           <w:p>
             <w:r>
-              <w:t>Data Dictionary</w:t>
+              <w:t>Script 1</w:t>
             </w:r>
           </w:p>
         </w:tc>
         <w:tc>
           <w:tcPr>
-            <w:tcW w:type="dxa" w:w="5184"/>
+            <w:tcW w:type="dxa" w:w="5040"/>
           </w:tcPr>
           <w:p>
             <w:r>
-              <w:t>technical name → business meaning/unit → preprocessing rule</w:t>
+              <w:t>EDA only: inspect → summarize → correlate → visualize → prepare to model</w:t>
             </w:r>
           </w:p>
         </w:tc>
@@ -1086,21 +921,21 @@
       <w:tr>
         <w:tc>
           <w:tcPr>
-            <w:tcW w:type="dxa" w:w="5184"/>
+            <w:tcW w:type="dxa" w:w="5040"/>
           </w:tcPr>
           <w:p>
             <w:r>
-              <w:t>Density + Area</w:t>
+              <w:t>Script 2</w:t>
             </w:r>
           </w:p>
         </w:tc>
         <w:tc>
           <w:tcPr>
-            <w:tcW w:type="dxa" w:w="5184"/>
+            <w:tcW w:type="dxa" w:w="5040"/>
           </w:tcPr>
           <w:p>
             <w:r>
-              <w:t>same spatial concept → redundancy/collinearity → choose one</w:t>
+              <w:t>OLS with Normal Equation: solve directly for w0/w1 → predict → residuals → MSE/R²</w:t>
             </w:r>
           </w:p>
         </w:tc>
@@ -1108,21 +943,21 @@
       <w:tr>
         <w:tc>
           <w:tcPr>
-            <w:tcW w:type="dxa" w:w="5184"/>
+            <w:tcW w:type="dxa" w:w="5040"/>
           </w:tcPr>
           <w:p>
             <w:r>
-              <w:t>KDE isolated bump</w:t>
+              <w:t>Script 3</w:t>
             </w:r>
           </w:p>
         </w:tc>
         <w:tc>
           <w:tcPr>
-            <w:tcW w:type="dxa" w:w="5184"/>
+            <w:tcW w:type="dxa" w:w="5040"/>
           </w:tcPr>
           <w:p>
             <w:r>
-              <w:t>secondary peak / multi-modality → investigate anomalous cluster</w:t>
+              <w:t>Gradient Descent: standardize → initialize weights → predict/error → gradient → update → repeat</w:t>
             </w:r>
           </w:p>
         </w:tc>
@@ -1130,21 +965,21 @@
       <w:tr>
         <w:tc>
           <w:tcPr>
-            <w:tcW w:type="dxa" w:w="5184"/>
+            <w:tcW w:type="dxa" w:w="5040"/>
           </w:tcPr>
           <w:p>
             <w:r>
-              <w:t>Right-skewed Density</w:t>
+              <w:t>w0</w:t>
             </w:r>
           </w:p>
         </w:tc>
         <w:tc>
           <w:tcPr>
-            <w:tcW w:type="dxa" w:w="5184"/>
+            <w:tcW w:type="dxa" w:w="5040"/>
           </w:tcPr>
           <w:p>
             <w:r>
-              <w:t>mean &amp; σ get pulled/inflated → Tukey quartiles are more robust</w:t>
+              <w:t>intercept / baseline prediction at X=0</w:t>
             </w:r>
           </w:p>
         </w:tc>
@@ -1152,21 +987,21 @@
       <w:tr>
         <w:tc>
           <w:tcPr>
-            <w:tcW w:type="dxa" w:w="5184"/>
+            <w:tcW w:type="dxa" w:w="5040"/>
           </w:tcPr>
           <w:p>
             <w:r>
-              <w:t>Z cutoff ≈ 12,970</w:t>
+              <w:t>w1</w:t>
             </w:r>
           </w:p>
         </w:tc>
         <w:tc>
           <w:tcPr>
-            <w:tcW w:type="dxa" w:w="5184"/>
+            <w:tcW w:type="dxa" w:w="5040"/>
           </w:tcPr>
           <w:p>
             <w:r>
-              <w:t>inflated by long urban tail → may miss severe skew</w:t>
+              <w:t>slope / predicted change in Y for +1 X</w:t>
             </w:r>
           </w:p>
         </w:tc>
@@ -1174,21 +1009,21 @@
       <w:tr>
         <w:tc>
           <w:tcPr>
-            <w:tcW w:type="dxa" w:w="5184"/>
+            <w:tcW w:type="dxa" w:w="5040"/>
           </w:tcPr>
           <w:p>
             <w:r>
-              <w:t>BonusMalus 50</w:t>
+              <w:t>Residual</w:t>
             </w:r>
           </w:p>
         </w:tc>
         <w:tc>
           <w:tcPr>
-            <w:tcW w:type="dxa" w:w="5184"/>
+            <w:tcW w:type="dxa" w:w="5040"/>
           </w:tcPr>
           <w:p>
             <w:r>
-              <w:t>safe driver → maximum 50% discount in course materials</w:t>
+              <w:t>actual − predicted</w:t>
             </w:r>
           </w:p>
         </w:tc>
@@ -1196,21 +1031,21 @@
       <w:tr>
         <w:tc>
           <w:tcPr>
-            <w:tcW w:type="dxa" w:w="5184"/>
+            <w:tcW w:type="dxa" w:w="5040"/>
           </w:tcPr>
           <w:p>
             <w:r>
-              <w:t>Raw bounds first</w:t>
+              <w:t>MSE</w:t>
             </w:r>
           </w:p>
         </w:tc>
         <w:tc>
           <w:tcPr>
-            <w:tcW w:type="dxa" w:w="5184"/>
+            <w:tcW w:type="dxa" w:w="5040"/>
           </w:tcPr>
           <w:p>
             <w:r>
-              <w:t>catch −999 / negative age / negative duration before trusting stats</w:t>
+              <w:t>average squared error; lower is better for comparable models</w:t>
             </w:r>
           </w:p>
         </w:tc>
@@ -1218,21 +1053,21 @@
       <w:tr>
         <w:tc>
           <w:tcPr>
-            <w:tcW w:type="dxa" w:w="5184"/>
+            <w:tcW w:type="dxa" w:w="5040"/>
           </w:tcPr>
           <w:p>
             <w:r>
-              <w:t>Urban Density dots</w:t>
+              <w:t>R²</w:t>
             </w:r>
           </w:p>
         </w:tc>
         <w:tc>
           <w:tcPr>
-            <w:tcW w:type="dxa" w:w="5184"/>
+            <w:tcW w:type="dxa" w:w="5040"/>
           </w:tcPr>
           <w:p>
             <w:r>
-              <w:t>statistical outlier ≠ corruption → retain + log(1+Density)</w:t>
+              <w:t>fraction of outcome variation explained</w:t>
             </w:r>
           </w:p>
         </w:tc>
@@ -1240,21 +1075,21 @@
       <w:tr>
         <w:tc>
           <w:tcPr>
-            <w:tcW w:type="dxa" w:w="5184"/>
+            <w:tcW w:type="dxa" w:w="5040"/>
           </w:tcPr>
           <w:p>
             <w:r>
-              <w:t>ClaimNb</w:t>
+              <w:t>Learning rate</w:t>
             </w:r>
           </w:p>
         </w:tc>
         <w:tc>
           <w:tcPr>
-            <w:tcW w:type="dxa" w:w="5184"/>
+            <w:tcW w:type="dxa" w:w="5040"/>
           </w:tcPr>
           <w:p>
             <w:r>
-              <w:t>discrete + &gt;95% zeros → Poisson GLM + log(Exposure) offset</w:t>
+              <w:t>size of each gradient update</w:t>
             </w:r>
           </w:p>
         </w:tc>
@@ -1262,21 +1097,43 @@
       <w:tr>
         <w:tc>
           <w:tcPr>
-            <w:tcW w:type="dxa" w:w="5184"/>
+            <w:tcW w:type="dxa" w:w="5040"/>
           </w:tcPr>
           <w:p>
             <w:r>
-              <w:t>Golden Rule</w:t>
+              <w:t>Epoch</w:t>
             </w:r>
           </w:p>
         </w:tc>
         <w:tc>
           <w:tcPr>
-            <w:tcW w:type="dxa" w:w="5184"/>
+            <w:tcW w:type="dxa" w:w="5040"/>
           </w:tcPr>
           <w:p>
             <w:r>
-              <w:t>training preprocessing = inference preprocessing</w:t>
+              <w:t>one full pass through training rows</w:t>
+            </w:r>
+          </w:p>
+        </w:tc>
+      </w:tr>
+      <w:tr>
+        <w:tc>
+          <w:tcPr>
+            <w:tcW w:type="dxa" w:w="5040"/>
+          </w:tcPr>
+          <w:p>
+            <w:r>
+              <w:t>Convergence</w:t>
+            </w:r>
+          </w:p>
+        </w:tc>
+        <w:tc>
+          <w:tcPr>
+            <w:tcW w:type="dxa" w:w="5040"/>
+          </w:tcPr>
+          <w:p>
+            <w:r>
+              <w:t>loss changes very little; iterative training has stabilized</w:t>
             </w:r>
           </w:p>
         </w:tc>
@@ -1287,107 +1144,113 @@
         <w:pStyle w:val="Heading1"/>
       </w:pPr>
       <w:r>
-        <w:t>Self-Quiz: Say the Answer Before Looking Back</w:t>
+        <w:t>Self-Quiz Pool</w:t>
       </w:r>
     </w:p>
     <w:p>
-      <w:pPr>
-        <w:spacing w:after="140"/>
-      </w:pPr>
       <w:r>
-        <w:t>1. What is the operational purpose of a Business Data Dictionary?</w:t>
+        <w:t>1. What is the main purpose of a Business Data Dictionary?</w:t>
       </w:r>
     </w:p>
     <w:p>
-      <w:pPr>
-        <w:spacing w:after="140"/>
-      </w:pPr>
       <w:r>
-        <w:t>2. Why are Density and Area redundant, and what problem can that cause in a linear model?</w:t>
+        <w:t>2. Why can Density and Area create collinearity?</w:t>
       </w:r>
     </w:p>
     <w:p>
-      <w:pPr>
-        <w:spacing w:after="140"/>
-      </w:pPr>
       <w:r>
-        <w:t>3. What does an isolated secondary peak on a KDE suggest?</w:t>
+        <w:t>3. What does an isolated secondary KDE peak suggest?</w:t>
       </w:r>
     </w:p>
     <w:p>
-      <w:pPr>
-        <w:spacing w:after="140"/>
-      </w:pPr>
       <w:r>
-        <w:t>4. Why are Tukey IQR fences more robust than Z-scores for heavily right-skewed Density?</w:t>
+        <w:t>4. Why is Tukey IQR more robust than Z-scores for a heavily skewed distribution?</w:t>
       </w:r>
     </w:p>
     <w:p>
-      <w:pPr>
-        <w:spacing w:after="140"/>
-      </w:pPr>
       <w:r>
-        <w:t>5. Why can the Density Z-score cutoff become artificially high?</w:t>
+        <w:t>5. Why can extreme values make a Z-score cutoff artificially high?</w:t>
       </w:r>
     </w:p>
     <w:p>
-      <w:pPr>
-        <w:spacing w:after="140"/>
-      </w:pPr>
       <w:r>
         <w:t>6. What does BonusMalus = 50 mean in the course materials?</w:t>
       </w:r>
     </w:p>
     <w:p>
-      <w:pPr>
-        <w:spacing w:after="140"/>
-      </w:pPr>
       <w:r>
-        <w:t>7. Name two corrupt values a raw-boundary audit could catch, and explain what they do to μ and σ.</w:t>
-      </w:r>
-    </w:p>
-    <w:p>
-      <w:pPr>
-        <w:spacing w:after="140"/>
-      </w:pPr>
-      <w:r>
-        <w:t>8. Why should valid high-density metropolitan records not automatically be deleted?</w:t>
-      </w:r>
-    </w:p>
-    <w:p>
-      <w:pPr>
-        <w:spacing w:after="140"/>
-      </w:pPr>
-      <w:r>
-        <w:t>9. Why is raw ClaimNb a poor OLS target, and what model does the course direct you to use?</w:t>
-      </w:r>
-    </w:p>
-    <w:p>
-      <w:pPr>
-        <w:spacing w:after="140"/>
-      </w:pPr>
-      <w:r>
-        <w:t>10. State the Golden Rule of training vs. production inference and one consequence of violating it.</w:t>
-      </w:r>
-    </w:p>
-    <w:p>
-      <w:pPr>
-        <w:pStyle w:val="Heading1"/>
-      </w:pPr>
-      <w:r>
-        <w:t>Where These Ideas Came From</w:t>
+        <w:t>7. Why should raw bounds be audited before scaling?</w:t>
       </w:r>
     </w:p>
     <w:p>
       <w:r>
-        <w:t>Primary study sources: Module 1 Step-by-Step Hands-On Lab Guide (especially pp. 7–9, 14–15, 17–23); Module 1 Practical Homework Assignment (Parts 2–5 and its solution guide); Demystifying Data: Counts, Volumes, and the Danger of Automated Tools; and the high-cardinality feature handout. The linear-regression scripts are useful background for understanding OLS, standardization, and gradient descent, but the formal Module 1 exam topics are most directly supported by the workshop and homework materials.</w:t>
+        <w:t>8. Why is a statistical outlier not automatically a bad record?</w:t>
+      </w:r>
+    </w:p>
+    <w:p>
+      <w:r>
+        <w:t>9. Why does ClaimNb lead the course toward a Poisson GLM with an Exposure offset?</w:t>
+      </w:r>
+    </w:p>
+    <w:p>
+      <w:r>
+        <w:t>10. What is the Golden Rule for training vs. production inference?</w:t>
+      </w:r>
+    </w:p>
+    <w:p>
+      <w:r>
+        <w:t>11. What does Pearson correlation tell you before regression?</w:t>
+      </w:r>
+    </w:p>
+    <w:p>
+      <w:r>
+        <w:t>12. What is the difference between a feature and a target?</w:t>
+      </w:r>
+    </w:p>
+    <w:p>
+      <w:r>
+        <w:t>13. What do w0 and w1 mean?</w:t>
+      </w:r>
+    </w:p>
+    <w:p>
+      <w:r>
+        <w:t>14. What is a residual?</w:t>
+      </w:r>
+    </w:p>
+    <w:p>
+      <w:r>
+        <w:t>15. How do MSE and R² differ?</w:t>
+      </w:r>
+    </w:p>
+    <w:p>
+      <w:r>
+        <w:t>16. What is the Normal Equation used for?</w:t>
+      </w:r>
+    </w:p>
+    <w:p>
+      <w:r>
+        <w:t>17. How is the Normal Equation different from Gradient Descent?</w:t>
+      </w:r>
+    </w:p>
+    <w:p>
+      <w:r>
+        <w:t>18. Why does the Gradient Descent script standardize BMI?</w:t>
+      </w:r>
+    </w:p>
+    <w:p>
+      <w:r>
+        <w:t>19. What happens when the learning rate is too large or too small?</w:t>
+      </w:r>
+    </w:p>
+    <w:p>
+      <w:r>
+        <w:t>20. What is an epoch, and what does convergence look like?</w:t>
       </w:r>
     </w:p>
     <w:sectPr>
-      <w:headerReference w:type="default" r:id="rId9"/>
-      <w:footerReference w:type="default" r:id="rId10"/>
+      <w:footerReference w:type="default" r:id="rId9"/>
       <w:pgSz w:w="12240" w:h="15840"/>
-      <w:pgMar w:top="792" w:right="936" w:bottom="792" w:left="936" w:header="720" w:footer="720" w:gutter="0"/>
+      <w:pgMar w:top="936" w:right="1080" w:bottom="936" w:left="1080" w:header="720" w:footer="720" w:gutter="0"/>
       <w:cols w:space="720"/>
       <w:docGrid w:linePitch="360"/>
     </w:sectPr>
@@ -1404,31 +1267,12 @@
     </w:pPr>
     <w:r>
       <w:rPr>
-        <w:i/>
-        <w:sz w:val="16"/>
-      </w:rPr>
-      <w:t>Study from the workshop + homework you already completed. Focus on WHY each analytics decision is made.</w:t>
+        <w:sz w:val="17"/>
+      </w:rPr>
+      <w:t>MSBA 265 — Module 1 Expanded Study Guide</w:t>
     </w:r>
   </w:p>
 </w:ftr>
-</file>
-
-<file path=word/header1.xml><?xml version="1.0" encoding="utf-8"?>
-<w:hdr xmlns:m="http://schemas.openxmlformats.org/officeDocument/2006/math" xmlns:mc="http://schemas.openxmlformats.org/markup-compatibility/2006" xmlns:mo="http://schemas.microsoft.com/office/mac/office/2008/main" xmlns:mv="urn:schemas-microsoft-com:mac:vml" xmlns:o="urn:schemas-microsoft-com:office:office" xmlns:r="http://schemas.openxmlformats.org/officeDocument/2006/relationships" xmlns:v="urn:schemas-microsoft-com:vml" xmlns:w10="urn:schemas-microsoft-com:office:word" xmlns:w14="http://schemas.microsoft.com/office/word/2010/wordml" xmlns:w="http://schemas.openxmlformats.org/wordprocessingml/2006/main" xmlns:wne="http://schemas.microsoft.com/office/word/2006/wordml" xmlns:wp14="http://schemas.microsoft.com/office/word/2010/wordprocessingDrawing" xmlns:wp="http://schemas.openxmlformats.org/drawingml/2006/wordprocessingDrawing" xmlns:wpc="http://schemas.microsoft.com/office/word/2010/wordprocessingCanvas" xmlns:wpg="http://schemas.microsoft.com/office/word/2010/wordprocessingGroup" xmlns:wpi="http://schemas.microsoft.com/office/word/2010/wordprocessingInk" xmlns:wps="http://schemas.microsoft.com/office/word/2010/wordprocessingShape" mc:Ignorable="w14 wp14">
-  <w:p>
-    <w:pPr>
-      <w:pStyle w:val="Header"/>
-      <w:jc w:val="right"/>
-    </w:pPr>
-    <w:r>
-      <w:rPr>
-        <w:color w:val="646464"/>
-        <w:sz w:val="16"/>
-      </w:rPr>
-      <w:t>MSBA 265 | Module 1 Exam Study Guide</w:t>
-    </w:r>
-  </w:p>
-</w:hdr>
 </file>
 
 <file path=word/numbering.xml><?xml version="1.0" encoding="utf-8"?>
@@ -1794,12 +1638,9 @@
     <w:name w:val="Normal"/>
     <w:qFormat/>
     <w:rsid w:val="00FC693F"/>
-    <w:pPr>
-      <w:spacing w:after="80"/>
-    </w:pPr>
     <w:rPr>
-      <w:rFonts w:ascii="Aptos" w:hAnsi="Aptos"/>
-      <w:sz w:val="21"/>
+      <w:rFonts w:ascii="Times New Roman" w:hAnsi="Times New Roman"/>
+      <w:sz w:val="22"/>
     </w:rPr>
   </w:style>
   <w:style w:type="paragraph" w:styleId="Header">
@@ -1861,11 +1702,11 @@
       <w:outlineLvl w:val="0"/>
     </w:pPr>
     <w:rPr>
-      <w:rFonts w:asciiTheme="majorHAnsi" w:eastAsiaTheme="majorEastAsia" w:hAnsiTheme="majorHAnsi" w:cstheme="majorBidi" w:ascii="Aptos Display" w:hAnsi="Aptos Display"/>
+      <w:rFonts w:asciiTheme="majorHAnsi" w:eastAsiaTheme="majorEastAsia" w:hAnsiTheme="majorHAnsi" w:cstheme="majorBidi"/>
       <w:b/>
       <w:bCs/>
-      <w:color w:val="17365D"/>
-      <w:sz w:val="30"/>
+      <w:color w:val="365F91" w:themeColor="accent1" w:themeShade="BF"/>
+      <w:sz w:val="28"/>
       <w:szCs w:val="28"/>
     </w:rPr>
   </w:style>
@@ -1885,11 +1726,11 @@
       <w:outlineLvl w:val="1"/>
     </w:pPr>
     <w:rPr>
-      <w:rFonts w:asciiTheme="majorHAnsi" w:eastAsiaTheme="majorEastAsia" w:hAnsiTheme="majorHAnsi" w:cstheme="majorBidi" w:ascii="Aptos Display" w:hAnsi="Aptos Display"/>
+      <w:rFonts w:asciiTheme="majorHAnsi" w:eastAsiaTheme="majorEastAsia" w:hAnsiTheme="majorHAnsi" w:cstheme="majorBidi"/>
       <w:b/>
       <w:bCs/>
-      <w:color w:val="2F5597"/>
-      <w:sz w:val="24"/>
+      <w:color w:val="4F81BD" w:themeColor="accent1"/>
+      <w:sz w:val="26"/>
       <w:szCs w:val="26"/>
     </w:rPr>
   </w:style>
@@ -2150,12 +1991,11 @@
       <w:contextualSpacing/>
     </w:pPr>
     <w:rPr>
-      <w:rFonts w:asciiTheme="majorHAnsi" w:eastAsiaTheme="majorEastAsia" w:hAnsiTheme="majorHAnsi" w:cstheme="majorBidi" w:ascii="Aptos Display" w:hAnsi="Aptos Display"/>
-      <w:b/>
-      <w:color w:val="17365D"/>
+      <w:rFonts w:asciiTheme="majorHAnsi" w:eastAsiaTheme="majorEastAsia" w:hAnsiTheme="majorHAnsi" w:cstheme="majorBidi"/>
+      <w:color w:val="17365D" w:themeColor="text2" w:themeShade="BF"/>
       <w:spacing w:val="5"/>
       <w:kern w:val="28"/>
-      <w:sz w:val="40"/>
+      <w:sz w:val="52"/>
       <w:szCs w:val="52"/>
     </w:rPr>
   </w:style>
@@ -13484,54 +13324,6 @@
         <w:shd w:val="clear" w:color="auto" w:fill="FBCAA2" w:themeFill="accent6" w:themeFillTint="7F"/>
       </w:tcPr>
     </w:tblStylePr>
-  </w:style>
-  <w:style w:type="paragraph" w:customStyle="1" w:styleId="StudyQuestion">
-    <w:name w:val="Study Question"/>
-    <w:pPr>
-      <w:spacing w:before="60" w:after="40"/>
-    </w:pPr>
-    <w:rPr>
-      <w:rFonts w:ascii="Aptos" w:hAnsi="Aptos"/>
-      <w:b/>
-      <w:color w:val="2F5597"/>
-      <w:sz w:val="21"/>
-    </w:rPr>
-  </w:style>
-  <w:style w:type="paragraph" w:customStyle="1" w:styleId="Answer">
-    <w:name w:val="Answer"/>
-    <w:pPr>
-      <w:spacing w:before="60" w:after="40"/>
-    </w:pPr>
-    <w:rPr>
-      <w:rFonts w:ascii="Aptos" w:hAnsi="Aptos"/>
-      <w:b/>
-      <w:color w:val="1F6D3A"/>
-      <w:sz w:val="21"/>
-    </w:rPr>
-  </w:style>
-  <w:style w:type="paragraph" w:customStyle="1" w:styleId="Why">
-    <w:name w:val="Why"/>
-    <w:pPr>
-      <w:spacing w:before="60" w:after="40"/>
-    </w:pPr>
-    <w:rPr>
-      <w:rFonts w:ascii="Aptos" w:hAnsi="Aptos"/>
-      <w:b/>
-      <w:color w:val="7F6000"/>
-      <w:sz w:val="21"/>
-    </w:rPr>
-  </w:style>
-  <w:style w:type="paragraph" w:customStyle="1" w:styleId="LookHere">
-    <w:name w:val="LookHere"/>
-    <w:pPr>
-      <w:spacing w:before="60" w:after="40"/>
-    </w:pPr>
-    <w:rPr>
-      <w:rFonts w:ascii="Aptos" w:hAnsi="Aptos"/>
-      <w:b/>
-      <w:color w:val="7030A0"/>
-      <w:sz w:val="21"/>
-    </w:rPr>
   </w:style>
 </w:styles>
 </file>

</xml_diff>